<commit_message>
Reformat payer claims landscape Word doc as category tables
</commit_message>
<xml_diff>
--- a/deliverables/ai_claims_landscape.docx
+++ b/deliverables/ai_claims_landscape.docx
@@ -25,14 +25,14 @@
           <w:b/>
           <w:i w:val="0"/>
           <w:color w:val="0F172A"/>
-          <w:sz w:val="36"/>
+          <w:sz w:val="34"/>
         </w:rPr>
         <w:t>AI-Native Companies for Medical Health-Insurance Payers</w:t>
       </w:r>
     </w:p>
     <w:p>
       <w:pPr>
-        <w:spacing w:after="80"/>
+        <w:spacing w:after="60"/>
       </w:pPr>
       <w:r>
         <w:rPr>
@@ -55,7 +55,7 @@
           <w:color w:val="475569"/>
           <w:sz w:val="17"/>
         </w:rPr>
-        <w:t>Managed services?  Yes = runs the process (managed / BPaaS) · Hybrid = software + managed option · No = software the plan operates.  Clients are publicly disclosed; "not public" = undisclosed.</w:t>
+        <w:t>Managed services?  Yes = runs the process (managed / BPaaS)  ·  Hybrid = software + managed option  ·  No = software the plan operates.   Clients are publicly disclosed; "not public" = undisclosed.</w:t>
       </w:r>
     </w:p>
     <w:p>
@@ -72,261 +72,433 @@
         <w:t>1 · Prior authorization &amp; utilization management</w:t>
       </w:r>
     </w:p>
+    <w:tbl>
+      <w:tblPr>
+        <w:tblStyle w:val="TableGrid"/>
+        <w:tblW w:type="auto" w:w="0"/>
+        <w:tblLook w:firstColumn="1" w:firstRow="1" w:lastColumn="0" w:lastRow="0" w:noHBand="0" w:noVBand="1" w:val="04A0"/>
+      </w:tblPr>
+      <w:tblGrid>
+        <w:gridCol w:w="3564"/>
+        <w:gridCol w:w="3564"/>
+        <w:gridCol w:w="3564"/>
+        <w:gridCol w:w="3564"/>
+      </w:tblGrid>
+      <w:tr>
+        <w:tc>
+          <w:tcPr>
+            <w:tcW w:type="dxa" w:w="1944"/>
+            <w:shd w:val="clear" w:fill="1E3A5F"/>
+            <w:vAlign w:val="center"/>
+          </w:tcPr>
+          <w:p>
+            <w:pPr>
+              <w:spacing w:after="0" w:before="0"/>
+            </w:pPr>
+            <w:r>
+              <w:rPr>
+                <w:b/>
+                <w:color w:val="FFFFFF"/>
+                <w:sz w:val="17"/>
+              </w:rPr>
+              <w:t>Company</w:t>
+            </w:r>
+          </w:p>
+        </w:tc>
+        <w:tc>
+          <w:tcPr>
+            <w:tcW w:type="dxa" w:w="6336"/>
+            <w:shd w:val="clear" w:fill="1E3A5F"/>
+            <w:vAlign w:val="center"/>
+          </w:tcPr>
+          <w:p>
+            <w:pPr>
+              <w:spacing w:after="0" w:before="0"/>
+            </w:pPr>
+            <w:r>
+              <w:rPr>
+                <w:b/>
+                <w:color w:val="FFFFFF"/>
+                <w:sz w:val="17"/>
+              </w:rPr>
+              <w:t>What they do</w:t>
+            </w:r>
+          </w:p>
+        </w:tc>
+        <w:tc>
+          <w:tcPr>
+            <w:tcW w:type="dxa" w:w="1872"/>
+            <w:shd w:val="clear" w:fill="1E3A5F"/>
+            <w:vAlign w:val="center"/>
+          </w:tcPr>
+          <w:p>
+            <w:pPr>
+              <w:spacing w:after="0" w:before="0"/>
+            </w:pPr>
+            <w:r>
+              <w:rPr>
+                <w:b/>
+                <w:color w:val="FFFFFF"/>
+                <w:sz w:val="17"/>
+              </w:rPr>
+              <w:t>Managed services</w:t>
+            </w:r>
+          </w:p>
+        </w:tc>
+        <w:tc>
+          <w:tcPr>
+            <w:tcW w:type="dxa" w:w="4104"/>
+            <w:shd w:val="clear" w:fill="1E3A5F"/>
+            <w:vAlign w:val="center"/>
+          </w:tcPr>
+          <w:p>
+            <w:pPr>
+              <w:spacing w:after="0" w:before="0"/>
+            </w:pPr>
+            <w:r>
+              <w:rPr>
+                <w:b/>
+                <w:color w:val="FFFFFF"/>
+                <w:sz w:val="17"/>
+              </w:rPr>
+              <w:t>Clients</w:t>
+            </w:r>
+          </w:p>
+        </w:tc>
+      </w:tr>
+      <w:tr>
+        <w:tc>
+          <w:tcPr>
+            <w:tcW w:type="dxa" w:w="1944"/>
+            <w:vAlign w:val="center"/>
+          </w:tcPr>
+          <w:p>
+            <w:pPr>
+              <w:spacing w:after="0" w:before="0"/>
+            </w:pPr>
+            <w:r>
+              <w:rPr>
+                <w:b/>
+                <w:color w:val="0F172A"/>
+                <w:sz w:val="17"/>
+              </w:rPr>
+              <w:t>Cohere Health</w:t>
+            </w:r>
+          </w:p>
+        </w:tc>
+        <w:tc>
+          <w:tcPr>
+            <w:tcW w:type="dxa" w:w="6336"/>
+            <w:vAlign w:val="center"/>
+          </w:tcPr>
+          <w:p>
+            <w:pPr>
+              <w:spacing w:after="0" w:before="0"/>
+            </w:pPr>
+            <w:r>
+              <w:rPr>
+                <w:b w:val="0"/>
+                <w:color w:val="475569"/>
+                <w:sz w:val="17"/>
+              </w:rPr>
+              <w:t>Category leader for PA/UM; auto-approves up to ~90% of requests; ~12M PA/yr; expanding into payment integrity.</w:t>
+            </w:r>
+          </w:p>
+        </w:tc>
+        <w:tc>
+          <w:tcPr>
+            <w:tcW w:type="dxa" w:w="1872"/>
+            <w:vAlign w:val="center"/>
+          </w:tcPr>
+          <w:p>
+            <w:pPr>
+              <w:spacing w:after="0" w:before="0"/>
+            </w:pPr>
+            <w:r>
+              <w:rPr>
+                <w:b/>
+                <w:color w:val="B45309"/>
+                <w:sz w:val="17"/>
+              </w:rPr>
+              <w:t>Hybrid</w:t>
+            </w:r>
+            <w:r>
+              <w:rPr>
+                <w:b w:val="0"/>
+                <w:color w:val="64748B"/>
+                <w:sz w:val="17"/>
+              </w:rPr>
+              <w:t xml:space="preserve"> (Cohere Complete delegated)</w:t>
+            </w:r>
+          </w:p>
+        </w:tc>
+        <w:tc>
+          <w:tcPr>
+            <w:tcW w:type="dxa" w:w="4104"/>
+            <w:vAlign w:val="center"/>
+          </w:tcPr>
+          <w:p>
+            <w:pPr>
+              <w:spacing w:after="0" w:before="0"/>
+            </w:pPr>
+            <w:r>
+              <w:rPr>
+                <w:b w:val="0"/>
+                <w:color w:val="475569"/>
+                <w:sz w:val="17"/>
+              </w:rPr>
+              <w:t>Humana (national MA + Commercial), Geisinger Health Plan, CMS; ~660K providers.</w:t>
+            </w:r>
+          </w:p>
+        </w:tc>
+      </w:tr>
+      <w:tr>
+        <w:tc>
+          <w:tcPr>
+            <w:tcW w:type="dxa" w:w="1944"/>
+            <w:vAlign w:val="center"/>
+          </w:tcPr>
+          <w:p>
+            <w:pPr>
+              <w:spacing w:after="0" w:before="0"/>
+            </w:pPr>
+            <w:r>
+              <w:rPr>
+                <w:b/>
+                <w:color w:val="0F172A"/>
+                <w:sz w:val="17"/>
+              </w:rPr>
+              <w:t>Anterior</w:t>
+            </w:r>
+          </w:p>
+        </w:tc>
+        <w:tc>
+          <w:tcPr>
+            <w:tcW w:type="dxa" w:w="6336"/>
+            <w:vAlign w:val="center"/>
+          </w:tcPr>
+          <w:p>
+            <w:pPr>
+              <w:spacing w:after="0" w:before="0"/>
+            </w:pPr>
+            <w:r>
+              <w:rPr>
+                <w:b w:val="0"/>
+                <w:color w:val="475569"/>
+                <w:sz w:val="17"/>
+              </w:rPr>
+              <w:t>(fmr. Co:Helm) AI for health-plan back office: prior auth, payment integrity, risk adjustment; $40M raised.</w:t>
+            </w:r>
+          </w:p>
+        </w:tc>
+        <w:tc>
+          <w:tcPr>
+            <w:tcW w:type="dxa" w:w="1872"/>
+            <w:vAlign w:val="center"/>
+          </w:tcPr>
+          <w:p>
+            <w:pPr>
+              <w:spacing w:after="0" w:before="0"/>
+            </w:pPr>
+            <w:r>
+              <w:rPr>
+                <w:b/>
+                <w:color w:val="64748B"/>
+                <w:sz w:val="17"/>
+              </w:rPr>
+              <w:t>No</w:t>
+            </w:r>
+            <w:r>
+              <w:rPr>
+                <w:b w:val="0"/>
+                <w:color w:val="64748B"/>
+                <w:sz w:val="17"/>
+              </w:rPr>
+              <w:t xml:space="preserve"> / unconfirmed</w:t>
+            </w:r>
+          </w:p>
+        </w:tc>
+        <w:tc>
+          <w:tcPr>
+            <w:tcW w:type="dxa" w:w="4104"/>
+            <w:vAlign w:val="center"/>
+          </w:tcPr>
+          <w:p>
+            <w:pPr>
+              <w:spacing w:after="0" w:before="0"/>
+            </w:pPr>
+            <w:r>
+              <w:rPr>
+                <w:b w:val="0"/>
+                <w:color w:val="475569"/>
+                <w:sz w:val="17"/>
+              </w:rPr>
+              <w:t>Geisinger Health Plan (others not public).</w:t>
+            </w:r>
+          </w:p>
+        </w:tc>
+      </w:tr>
+      <w:tr>
+        <w:tc>
+          <w:tcPr>
+            <w:tcW w:type="dxa" w:w="1944"/>
+            <w:vAlign w:val="center"/>
+          </w:tcPr>
+          <w:p>
+            <w:pPr>
+              <w:spacing w:after="0" w:before="0"/>
+            </w:pPr>
+            <w:r>
+              <w:rPr>
+                <w:b/>
+                <w:color w:val="0F172A"/>
+                <w:sz w:val="17"/>
+              </w:rPr>
+              <w:t>Basys.ai</w:t>
+            </w:r>
+          </w:p>
+        </w:tc>
+        <w:tc>
+          <w:tcPr>
+            <w:tcW w:type="dxa" w:w="6336"/>
+            <w:vAlign w:val="center"/>
+          </w:tcPr>
+          <w:p>
+            <w:pPr>
+              <w:spacing w:after="0" w:before="0"/>
+            </w:pPr>
+            <w:r>
+              <w:rPr>
+                <w:b w:val="0"/>
+                <w:color w:val="475569"/>
+                <w:sz w:val="17"/>
+              </w:rPr>
+              <w:t>Enterprise generative AI spanning prior auth, UM, and payment integrity for health plans.</w:t>
+            </w:r>
+          </w:p>
+        </w:tc>
+        <w:tc>
+          <w:tcPr>
+            <w:tcW w:type="dxa" w:w="1872"/>
+            <w:vAlign w:val="center"/>
+          </w:tcPr>
+          <w:p>
+            <w:pPr>
+              <w:spacing w:after="0" w:before="0"/>
+            </w:pPr>
+            <w:r>
+              <w:rPr>
+                <w:b/>
+                <w:color w:val="64748B"/>
+                <w:sz w:val="17"/>
+              </w:rPr>
+              <w:t>No</w:t>
+            </w:r>
+          </w:p>
+        </w:tc>
+        <w:tc>
+          <w:tcPr>
+            <w:tcW w:type="dxa" w:w="4104"/>
+            <w:vAlign w:val="center"/>
+          </w:tcPr>
+          <w:p>
+            <w:pPr>
+              <w:spacing w:after="0" w:before="0"/>
+            </w:pPr>
+            <w:r>
+              <w:rPr>
+                <w:b w:val="0"/>
+                <w:color w:val="475569"/>
+                <w:sz w:val="17"/>
+              </w:rPr>
+              <w:t>Health plans (names not public).</w:t>
+            </w:r>
+          </w:p>
+        </w:tc>
+      </w:tr>
+      <w:tr>
+        <w:tc>
+          <w:tcPr>
+            <w:tcW w:type="dxa" w:w="1944"/>
+            <w:vAlign w:val="center"/>
+          </w:tcPr>
+          <w:p>
+            <w:pPr>
+              <w:spacing w:after="0" w:before="0"/>
+            </w:pPr>
+            <w:r>
+              <w:rPr>
+                <w:b/>
+                <w:color w:val="0F172A"/>
+                <w:sz w:val="17"/>
+              </w:rPr>
+              <w:t>Itiliti Health</w:t>
+            </w:r>
+          </w:p>
+        </w:tc>
+        <w:tc>
+          <w:tcPr>
+            <w:tcW w:type="dxa" w:w="6336"/>
+            <w:vAlign w:val="center"/>
+          </w:tcPr>
+          <w:p>
+            <w:pPr>
+              <w:spacing w:after="0" w:before="0"/>
+            </w:pPr>
+            <w:r>
+              <w:rPr>
+                <w:b w:val="0"/>
+                <w:color w:val="475569"/>
+                <w:sz w:val="17"/>
+              </w:rPr>
+              <w:t>Prior-authorization automation for payers (API/interoperability, CMS-0057 compliance).</w:t>
+            </w:r>
+          </w:p>
+        </w:tc>
+        <w:tc>
+          <w:tcPr>
+            <w:tcW w:type="dxa" w:w="1872"/>
+            <w:vAlign w:val="center"/>
+          </w:tcPr>
+          <w:p>
+            <w:pPr>
+              <w:spacing w:after="0" w:before="0"/>
+            </w:pPr>
+            <w:r>
+              <w:rPr>
+                <w:b/>
+                <w:color w:val="64748B"/>
+                <w:sz w:val="17"/>
+              </w:rPr>
+              <w:t>No</w:t>
+            </w:r>
+          </w:p>
+        </w:tc>
+        <w:tc>
+          <w:tcPr>
+            <w:tcW w:type="dxa" w:w="4104"/>
+            <w:vAlign w:val="center"/>
+          </w:tcPr>
+          <w:p>
+            <w:pPr>
+              <w:spacing w:after="0" w:before="0"/>
+            </w:pPr>
+            <w:r>
+              <w:rPr>
+                <w:b w:val="0"/>
+                <w:color w:val="475569"/>
+                <w:sz w:val="17"/>
+              </w:rPr>
+              <w:t>Payers &amp; providers (names largely not public).</w:t>
+            </w:r>
+          </w:p>
+        </w:tc>
+      </w:tr>
+    </w:tbl>
     <w:p>
       <w:pPr>
-        <w:pStyle w:val="ListBullet"/>
-        <w:spacing w:after="20"/>
+        <w:spacing w:after="80"/>
       </w:pPr>
-      <w:r>
-        <w:rPr>
-          <w:b/>
-          <w:color w:val="0F172A"/>
-          <w:sz w:val="21"/>
-        </w:rPr>
-        <w:t>Cohere Health</w:t>
-      </w:r>
-      <w:r>
-        <w:rPr>
-          <w:color w:val="475569"/>
-          <w:sz w:val="20"/>
-        </w:rPr>
-        <w:t xml:space="preserve"> — category leader for PA/UM; auto-approves up to ~90% of requests; ~12M PA/yr; expanding into payment integrity.</w:t>
-      </w:r>
-    </w:p>
-    <w:p>
-      <w:pPr>
-        <w:spacing w:after="120"/>
-        <w:ind w:left="360"/>
-      </w:pPr>
-      <w:r>
-        <w:rPr>
-          <w:color w:val="64748B"/>
-          <w:sz w:val="18"/>
-        </w:rPr>
-        <w:t xml:space="preserve">Managed services: </w:t>
-      </w:r>
-      <w:r>
-        <w:rPr>
-          <w:b/>
-          <w:color w:val="B45309"/>
-          <w:sz w:val="18"/>
-        </w:rPr>
-        <w:t>Hybrid</w:t>
-      </w:r>
-      <w:r>
-        <w:rPr>
-          <w:color w:val="64748B"/>
-          <w:sz w:val="18"/>
-        </w:rPr>
-        <w:t xml:space="preserve"> — in-house software + delegated managed (Cohere Complete).</w:t>
-      </w:r>
-      <w:r>
-        <w:rPr>
-          <w:b/>
-          <w:color w:val="64748B"/>
-          <w:sz w:val="18"/>
-        </w:rPr>
-        <w:t xml:space="preserve">   |   Clients: </w:t>
-      </w:r>
-      <w:r>
-        <w:rPr>
-          <w:color w:val="475569"/>
-          <w:sz w:val="18"/>
-        </w:rPr>
-        <w:t>Humana (national MA + Commercial), Geisinger Health Plan, CMS; ~660K providers.</w:t>
-      </w:r>
-    </w:p>
-    <w:p>
-      <w:pPr>
-        <w:pStyle w:val="ListBullet"/>
-        <w:spacing w:after="20"/>
-      </w:pPr>
-      <w:r>
-        <w:rPr>
-          <w:b/>
-          <w:color w:val="0F172A"/>
-          <w:sz w:val="21"/>
-        </w:rPr>
-        <w:t>Anterior (fmr. Co:Helm)</w:t>
-      </w:r>
-      <w:r>
-        <w:rPr>
-          <w:color w:val="475569"/>
-          <w:sz w:val="20"/>
-        </w:rPr>
-        <w:t xml:space="preserve"> — AI for health-plan back office: prior auth, payment integrity, risk adjustment; $40M raised.</w:t>
-      </w:r>
-    </w:p>
-    <w:p>
-      <w:pPr>
-        <w:spacing w:after="120"/>
-        <w:ind w:left="360"/>
-      </w:pPr>
-      <w:r>
-        <w:rPr>
-          <w:color w:val="64748B"/>
-          <w:sz w:val="18"/>
-        </w:rPr>
-        <w:t xml:space="preserve">Managed services: </w:t>
-      </w:r>
-      <w:r>
-        <w:rPr>
-          <w:b/>
-          <w:color w:val="64748B"/>
-          <w:sz w:val="18"/>
-        </w:rPr>
-        <w:t>No</w:t>
-      </w:r>
-      <w:r>
-        <w:rPr>
-          <w:color w:val="64748B"/>
-          <w:sz w:val="18"/>
-        </w:rPr>
-        <w:t xml:space="preserve"> / unconfirmed — payer back-office automation.</w:t>
-      </w:r>
-      <w:r>
-        <w:rPr>
-          <w:b/>
-          <w:color w:val="64748B"/>
-          <w:sz w:val="18"/>
-        </w:rPr>
-        <w:t xml:space="preserve">   |   Clients: </w:t>
-      </w:r>
-      <w:r>
-        <w:rPr>
-          <w:color w:val="475569"/>
-          <w:sz w:val="18"/>
-        </w:rPr>
-        <w:t>Geisinger Health Plan (others not public).</w:t>
-      </w:r>
-    </w:p>
-    <w:p>
-      <w:pPr>
-        <w:pStyle w:val="ListBullet"/>
-        <w:spacing w:after="20"/>
-      </w:pPr>
-      <w:r>
-        <w:rPr>
-          <w:b/>
-          <w:color w:val="0F172A"/>
-          <w:sz w:val="21"/>
-        </w:rPr>
-        <w:t>Basys.ai</w:t>
-      </w:r>
-      <w:r>
-        <w:rPr>
-          <w:color w:val="475569"/>
-          <w:sz w:val="20"/>
-        </w:rPr>
-        <w:t xml:space="preserve"> — enterprise generative AI spanning prior auth, UM, and payment integrity for health plans.</w:t>
-      </w:r>
-    </w:p>
-    <w:p>
-      <w:pPr>
-        <w:spacing w:after="120"/>
-        <w:ind w:left="360"/>
-      </w:pPr>
-      <w:r>
-        <w:rPr>
-          <w:color w:val="64748B"/>
-          <w:sz w:val="18"/>
-        </w:rPr>
-        <w:t xml:space="preserve">Managed services: </w:t>
-      </w:r>
-      <w:r>
-        <w:rPr>
-          <w:b/>
-          <w:color w:val="64748B"/>
-          <w:sz w:val="18"/>
-        </w:rPr>
-        <w:t>No</w:t>
-      </w:r>
-      <w:r>
-        <w:rPr>
-          <w:color w:val="64748B"/>
-          <w:sz w:val="18"/>
-        </w:rPr>
-        <w:t xml:space="preserve"> — genAI automation platform.</w:t>
-      </w:r>
-      <w:r>
-        <w:rPr>
-          <w:b/>
-          <w:color w:val="64748B"/>
-          <w:sz w:val="18"/>
-        </w:rPr>
-        <w:t xml:space="preserve">   |   Clients: </w:t>
-      </w:r>
-      <w:r>
-        <w:rPr>
-          <w:color w:val="475569"/>
-          <w:sz w:val="18"/>
-        </w:rPr>
-        <w:t>health plans (names not public).</w:t>
-      </w:r>
-    </w:p>
-    <w:p>
-      <w:pPr>
-        <w:pStyle w:val="ListBullet"/>
-        <w:spacing w:after="20"/>
-      </w:pPr>
-      <w:r>
-        <w:rPr>
-          <w:b/>
-          <w:color w:val="0F172A"/>
-          <w:sz w:val="21"/>
-        </w:rPr>
-        <w:t>Itiliti Health</w:t>
-      </w:r>
-      <w:r>
-        <w:rPr>
-          <w:color w:val="475569"/>
-          <w:sz w:val="20"/>
-        </w:rPr>
-        <w:t xml:space="preserve"> — prior-authorization automation for payers (API/interoperability, CMS-0057 compliance).</w:t>
-      </w:r>
-    </w:p>
-    <w:p>
-      <w:pPr>
-        <w:spacing w:after="120"/>
-        <w:ind w:left="360"/>
-      </w:pPr>
-      <w:r>
-        <w:rPr>
-          <w:color w:val="64748B"/>
-          <w:sz w:val="18"/>
-        </w:rPr>
-        <w:t xml:space="preserve">Managed services: </w:t>
-      </w:r>
-      <w:r>
-        <w:rPr>
-          <w:b/>
-          <w:color w:val="64748B"/>
-          <w:sz w:val="18"/>
-        </w:rPr>
-        <w:t>No</w:t>
-      </w:r>
-      <w:r>
-        <w:rPr>
-          <w:color w:val="64748B"/>
-          <w:sz w:val="18"/>
-        </w:rPr>
-        <w:t xml:space="preserve"> — software/API platform.</w:t>
-      </w:r>
-      <w:r>
-        <w:rPr>
-          <w:b/>
-          <w:color w:val="64748B"/>
-          <w:sz w:val="18"/>
-        </w:rPr>
-        <w:t xml:space="preserve">   |   Clients: </w:t>
-      </w:r>
-      <w:r>
-        <w:rPr>
-          <w:color w:val="475569"/>
-          <w:sz w:val="18"/>
-        </w:rPr>
-        <w:t>payers &amp; providers (names largely not public).</w:t>
-      </w:r>
     </w:p>
     <w:p>
       <w:pPr>
@@ -342,325 +514,503 @@
         <w:t>2 · Payment integrity &amp; payment accuracy</w:t>
       </w:r>
     </w:p>
+    <w:tbl>
+      <w:tblPr>
+        <w:tblStyle w:val="TableGrid"/>
+        <w:tblW w:type="auto" w:w="0"/>
+        <w:tblLook w:firstColumn="1" w:firstRow="1" w:lastColumn="0" w:lastRow="0" w:noHBand="0" w:noVBand="1" w:val="04A0"/>
+      </w:tblPr>
+      <w:tblGrid>
+        <w:gridCol w:w="3564"/>
+        <w:gridCol w:w="3564"/>
+        <w:gridCol w:w="3564"/>
+        <w:gridCol w:w="3564"/>
+      </w:tblGrid>
+      <w:tr>
+        <w:tc>
+          <w:tcPr>
+            <w:tcW w:type="dxa" w:w="1944"/>
+            <w:shd w:val="clear" w:fill="1E3A5F"/>
+            <w:vAlign w:val="center"/>
+          </w:tcPr>
+          <w:p>
+            <w:pPr>
+              <w:spacing w:after="0" w:before="0"/>
+            </w:pPr>
+            <w:r>
+              <w:rPr>
+                <w:b/>
+                <w:color w:val="FFFFFF"/>
+                <w:sz w:val="17"/>
+              </w:rPr>
+              <w:t>Company</w:t>
+            </w:r>
+          </w:p>
+        </w:tc>
+        <w:tc>
+          <w:tcPr>
+            <w:tcW w:type="dxa" w:w="6336"/>
+            <w:shd w:val="clear" w:fill="1E3A5F"/>
+            <w:vAlign w:val="center"/>
+          </w:tcPr>
+          <w:p>
+            <w:pPr>
+              <w:spacing w:after="0" w:before="0"/>
+            </w:pPr>
+            <w:r>
+              <w:rPr>
+                <w:b/>
+                <w:color w:val="FFFFFF"/>
+                <w:sz w:val="17"/>
+              </w:rPr>
+              <w:t>What they do</w:t>
+            </w:r>
+          </w:p>
+        </w:tc>
+        <w:tc>
+          <w:tcPr>
+            <w:tcW w:type="dxa" w:w="1872"/>
+            <w:shd w:val="clear" w:fill="1E3A5F"/>
+            <w:vAlign w:val="center"/>
+          </w:tcPr>
+          <w:p>
+            <w:pPr>
+              <w:spacing w:after="0" w:before="0"/>
+            </w:pPr>
+            <w:r>
+              <w:rPr>
+                <w:b/>
+                <w:color w:val="FFFFFF"/>
+                <w:sz w:val="17"/>
+              </w:rPr>
+              <w:t>Managed services</w:t>
+            </w:r>
+          </w:p>
+        </w:tc>
+        <w:tc>
+          <w:tcPr>
+            <w:tcW w:type="dxa" w:w="4104"/>
+            <w:shd w:val="clear" w:fill="1E3A5F"/>
+            <w:vAlign w:val="center"/>
+          </w:tcPr>
+          <w:p>
+            <w:pPr>
+              <w:spacing w:after="0" w:before="0"/>
+            </w:pPr>
+            <w:r>
+              <w:rPr>
+                <w:b/>
+                <w:color w:val="FFFFFF"/>
+                <w:sz w:val="17"/>
+              </w:rPr>
+              <w:t>Clients</w:t>
+            </w:r>
+          </w:p>
+        </w:tc>
+      </w:tr>
+      <w:tr>
+        <w:tc>
+          <w:tcPr>
+            <w:tcW w:type="dxa" w:w="1944"/>
+            <w:vAlign w:val="center"/>
+          </w:tcPr>
+          <w:p>
+            <w:pPr>
+              <w:spacing w:after="0" w:before="0"/>
+            </w:pPr>
+            <w:r>
+              <w:rPr>
+                <w:b/>
+                <w:color w:val="0F172A"/>
+                <w:sz w:val="17"/>
+              </w:rPr>
+              <w:t>Machinify</w:t>
+            </w:r>
+          </w:p>
+        </w:tc>
+        <w:tc>
+          <w:tcPr>
+            <w:tcW w:type="dxa" w:w="6336"/>
+            <w:vAlign w:val="center"/>
+          </w:tcPr>
+          <w:p>
+            <w:pPr>
+              <w:spacing w:after="0" w:before="0"/>
+            </w:pPr>
+            <w:r>
+              <w:rPr>
+                <w:b w:val="0"/>
+                <w:color w:val="475569"/>
+                <w:sz w:val="17"/>
+              </w:rPr>
+              <w:t>Unified pre-pay + post-pay payment-integrity platform across the claim lifecycle.</w:t>
+            </w:r>
+          </w:p>
+        </w:tc>
+        <w:tc>
+          <w:tcPr>
+            <w:tcW w:type="dxa" w:w="1872"/>
+            <w:vAlign w:val="center"/>
+          </w:tcPr>
+          <w:p>
+            <w:pPr>
+              <w:spacing w:after="0" w:before="0"/>
+            </w:pPr>
+            <w:r>
+              <w:rPr>
+                <w:b/>
+                <w:color w:val="B45309"/>
+                <w:sz w:val="17"/>
+              </w:rPr>
+              <w:t>Hybrid</w:t>
+            </w:r>
+            <w:r>
+              <w:rPr>
+                <w:b w:val="0"/>
+                <w:color w:val="64748B"/>
+                <w:sz w:val="17"/>
+              </w:rPr>
+              <w:t xml:space="preserve"> (+ recovery services)</w:t>
+            </w:r>
+          </w:p>
+        </w:tc>
+        <w:tc>
+          <w:tcPr>
+            <w:tcW w:type="dxa" w:w="4104"/>
+            <w:vAlign w:val="center"/>
+          </w:tcPr>
+          <w:p>
+            <w:pPr>
+              <w:spacing w:after="0" w:before="0"/>
+            </w:pPr>
+            <w:r>
+              <w:rPr>
+                <w:b w:val="0"/>
+                <w:color w:val="475569"/>
+                <w:sz w:val="17"/>
+              </w:rPr>
+              <w:t>National/regional health plans (names not public).</w:t>
+            </w:r>
+          </w:p>
+        </w:tc>
+      </w:tr>
+      <w:tr>
+        <w:tc>
+          <w:tcPr>
+            <w:tcW w:type="dxa" w:w="1944"/>
+            <w:vAlign w:val="center"/>
+          </w:tcPr>
+          <w:p>
+            <w:pPr>
+              <w:spacing w:after="0" w:before="0"/>
+            </w:pPr>
+            <w:r>
+              <w:rPr>
+                <w:b/>
+                <w:color w:val="0F172A"/>
+                <w:sz w:val="17"/>
+              </w:rPr>
+              <w:t>Codoxo</w:t>
+            </w:r>
+          </w:p>
+        </w:tc>
+        <w:tc>
+          <w:tcPr>
+            <w:tcW w:type="dxa" w:w="6336"/>
+            <w:vAlign w:val="center"/>
+          </w:tcPr>
+          <w:p>
+            <w:pPr>
+              <w:spacing w:after="0" w:before="0"/>
+            </w:pPr>
+            <w:r>
+              <w:rPr>
+                <w:b w:val="0"/>
+                <w:color w:val="475569"/>
+                <w:sz w:val="17"/>
+              </w:rPr>
+              <w:t>GenAI Unified Cost Containment; 'Point Zero' intervenes pre-claim; 80M+ lives. $69M raised ($35M Series C led by CVS Health Ventures, Dec '25).</w:t>
+            </w:r>
+          </w:p>
+        </w:tc>
+        <w:tc>
+          <w:tcPr>
+            <w:tcW w:type="dxa" w:w="1872"/>
+            <w:vAlign w:val="center"/>
+          </w:tcPr>
+          <w:p>
+            <w:pPr>
+              <w:spacing w:after="0" w:before="0"/>
+            </w:pPr>
+            <w:r>
+              <w:rPr>
+                <w:b/>
+                <w:color w:val="B45309"/>
+                <w:sz w:val="17"/>
+              </w:rPr>
+              <w:t>Hybrid</w:t>
+            </w:r>
+          </w:p>
+        </w:tc>
+        <w:tc>
+          <w:tcPr>
+            <w:tcW w:type="dxa" w:w="4104"/>
+            <w:vAlign w:val="center"/>
+          </w:tcPr>
+          <w:p>
+            <w:pPr>
+              <w:spacing w:after="0" w:before="0"/>
+            </w:pPr>
+            <w:r>
+              <w:rPr>
+                <w:b w:val="0"/>
+                <w:color w:val="475569"/>
+                <w:sz w:val="17"/>
+              </w:rPr>
+              <w:t>Large US health plans (CVS Health Ventures-backed; names not public).</w:t>
+            </w:r>
+          </w:p>
+        </w:tc>
+      </w:tr>
+      <w:tr>
+        <w:tc>
+          <w:tcPr>
+            <w:tcW w:type="dxa" w:w="1944"/>
+            <w:vAlign w:val="center"/>
+          </w:tcPr>
+          <w:p>
+            <w:pPr>
+              <w:spacing w:after="0" w:before="0"/>
+            </w:pPr>
+            <w:r>
+              <w:rPr>
+                <w:b/>
+                <w:color w:val="0F172A"/>
+                <w:sz w:val="17"/>
+              </w:rPr>
+              <w:t>Lyric (lyric.ai)</w:t>
+            </w:r>
+          </w:p>
+        </w:tc>
+        <w:tc>
+          <w:tcPr>
+            <w:tcW w:type="dxa" w:w="6336"/>
+            <w:vAlign w:val="center"/>
+          </w:tcPr>
+          <w:p>
+            <w:pPr>
+              <w:spacing w:after="0" w:before="0"/>
+            </w:pPr>
+            <w:r>
+              <w:rPr>
+                <w:b w:val="0"/>
+                <w:color w:val="475569"/>
+                <w:sz w:val="17"/>
+              </w:rPr>
+              <w:t>AI payment-accuracy for health plans; reviews &gt;50% of US claims (~190M Americans). AI-forward; legacy roots in ClaimsXten.</w:t>
+            </w:r>
+          </w:p>
+        </w:tc>
+        <w:tc>
+          <w:tcPr>
+            <w:tcW w:type="dxa" w:w="1872"/>
+            <w:vAlign w:val="center"/>
+          </w:tcPr>
+          <w:p>
+            <w:pPr>
+              <w:spacing w:after="0" w:before="0"/>
+            </w:pPr>
+            <w:r>
+              <w:rPr>
+                <w:b/>
+                <w:color w:val="B45309"/>
+                <w:sz w:val="17"/>
+              </w:rPr>
+              <w:t>Hybrid</w:t>
+            </w:r>
+          </w:p>
+        </w:tc>
+        <w:tc>
+          <w:tcPr>
+            <w:tcW w:type="dxa" w:w="4104"/>
+            <w:vAlign w:val="center"/>
+          </w:tcPr>
+          <w:p>
+            <w:pPr>
+              <w:spacing w:after="0" w:before="0"/>
+            </w:pPr>
+            <w:r>
+              <w:rPr>
+                <w:b w:val="0"/>
+                <w:color w:val="475569"/>
+                <w:sz w:val="17"/>
+              </w:rPr>
+              <w:t>Major national health plans (~190M lives; names not public).</w:t>
+            </w:r>
+          </w:p>
+        </w:tc>
+      </w:tr>
+      <w:tr>
+        <w:tc>
+          <w:tcPr>
+            <w:tcW w:type="dxa" w:w="1944"/>
+            <w:vAlign w:val="center"/>
+          </w:tcPr>
+          <w:p>
+            <w:pPr>
+              <w:spacing w:after="0" w:before="0"/>
+            </w:pPr>
+            <w:r>
+              <w:rPr>
+                <w:b/>
+                <w:color w:val="0F172A"/>
+                <w:sz w:val="17"/>
+              </w:rPr>
+              <w:t>ClarisHealth</w:t>
+            </w:r>
+          </w:p>
+        </w:tc>
+        <w:tc>
+          <w:tcPr>
+            <w:tcW w:type="dxa" w:w="6336"/>
+            <w:vAlign w:val="center"/>
+          </w:tcPr>
+          <w:p>
+            <w:pPr>
+              <w:spacing w:after="0" w:before="0"/>
+            </w:pPr>
+            <w:r>
+              <w:rPr>
+                <w:b w:val="0"/>
+                <w:color w:val="475569"/>
+                <w:sz w:val="17"/>
+              </w:rPr>
+              <w:t>Pareo payment-integrity platform for health plans (recoveries + admin-cost reduction).</w:t>
+            </w:r>
+          </w:p>
+        </w:tc>
+        <w:tc>
+          <w:tcPr>
+            <w:tcW w:type="dxa" w:w="1872"/>
+            <w:vAlign w:val="center"/>
+          </w:tcPr>
+          <w:p>
+            <w:pPr>
+              <w:spacing w:after="0" w:before="0"/>
+            </w:pPr>
+            <w:r>
+              <w:rPr>
+                <w:b/>
+                <w:color w:val="64748B"/>
+                <w:sz w:val="17"/>
+              </w:rPr>
+              <w:t>No</w:t>
+            </w:r>
+          </w:p>
+        </w:tc>
+        <w:tc>
+          <w:tcPr>
+            <w:tcW w:type="dxa" w:w="4104"/>
+            <w:vAlign w:val="center"/>
+          </w:tcPr>
+          <w:p>
+            <w:pPr>
+              <w:spacing w:after="0" w:before="0"/>
+            </w:pPr>
+            <w:r>
+              <w:rPr>
+                <w:b w:val="0"/>
+                <w:color w:val="475569"/>
+                <w:sz w:val="17"/>
+              </w:rPr>
+              <w:t>Regional &amp; national health plans (names not public).</w:t>
+            </w:r>
+          </w:p>
+        </w:tc>
+      </w:tr>
+      <w:tr>
+        <w:tc>
+          <w:tcPr>
+            <w:tcW w:type="dxa" w:w="1944"/>
+            <w:vAlign w:val="center"/>
+          </w:tcPr>
+          <w:p>
+            <w:pPr>
+              <w:spacing w:after="0" w:before="0"/>
+            </w:pPr>
+            <w:r>
+              <w:rPr>
+                <w:b/>
+                <w:color w:val="0F172A"/>
+                <w:sz w:val="17"/>
+              </w:rPr>
+              <w:t>Rialtic</w:t>
+            </w:r>
+          </w:p>
+        </w:tc>
+        <w:tc>
+          <w:tcPr>
+            <w:tcW w:type="dxa" w:w="6336"/>
+            <w:vAlign w:val="center"/>
+          </w:tcPr>
+          <w:p>
+            <w:pPr>
+              <w:spacing w:after="0" w:before="0"/>
+            </w:pPr>
+            <w:r>
+              <w:rPr>
+                <w:b w:val="0"/>
+                <w:color w:val="475569"/>
+                <w:sz w:val="17"/>
+              </w:rPr>
+              <w:t>AI clinical &amp; payment-policy engine for payers (payment integrity / claims editing). Lighter public detail.</w:t>
+            </w:r>
+          </w:p>
+        </w:tc>
+        <w:tc>
+          <w:tcPr>
+            <w:tcW w:type="dxa" w:w="1872"/>
+            <w:vAlign w:val="center"/>
+          </w:tcPr>
+          <w:p>
+            <w:pPr>
+              <w:spacing w:after="0" w:before="0"/>
+            </w:pPr>
+            <w:r>
+              <w:rPr>
+                <w:b/>
+                <w:color w:val="B45309"/>
+                <w:sz w:val="17"/>
+              </w:rPr>
+              <w:t>Hybrid</w:t>
+            </w:r>
+          </w:p>
+        </w:tc>
+        <w:tc>
+          <w:tcPr>
+            <w:tcW w:type="dxa" w:w="4104"/>
+            <w:vAlign w:val="center"/>
+          </w:tcPr>
+          <w:p>
+            <w:pPr>
+              <w:spacing w:after="0" w:before="0"/>
+            </w:pPr>
+            <w:r>
+              <w:rPr>
+                <w:b w:val="0"/>
+                <w:color w:val="475569"/>
+                <w:sz w:val="17"/>
+              </w:rPr>
+              <w:t>Health plans (not public).</w:t>
+            </w:r>
+          </w:p>
+        </w:tc>
+      </w:tr>
+    </w:tbl>
     <w:p>
       <w:pPr>
-        <w:pStyle w:val="ListBullet"/>
-        <w:spacing w:after="20"/>
+        <w:spacing w:after="80"/>
       </w:pPr>
-      <w:r>
-        <w:rPr>
-          <w:b/>
-          <w:color w:val="0F172A"/>
-          <w:sz w:val="21"/>
-        </w:rPr>
-        <w:t>Machinify</w:t>
-      </w:r>
-      <w:r>
-        <w:rPr>
-          <w:color w:val="475569"/>
-          <w:sz w:val="20"/>
-        </w:rPr>
-        <w:t xml:space="preserve"> — unified pre-pay + post-pay payment-integrity platform across the claim lifecycle.</w:t>
-      </w:r>
-    </w:p>
-    <w:p>
-      <w:pPr>
-        <w:spacing w:after="120"/>
-        <w:ind w:left="360"/>
-      </w:pPr>
-      <w:r>
-        <w:rPr>
-          <w:color w:val="64748B"/>
-          <w:sz w:val="18"/>
-        </w:rPr>
-        <w:t xml:space="preserve">Managed services: </w:t>
-      </w:r>
-      <w:r>
-        <w:rPr>
-          <w:b/>
-          <w:color w:val="B45309"/>
-          <w:sz w:val="18"/>
-        </w:rPr>
-        <w:t>Hybrid</w:t>
-      </w:r>
-      <w:r>
-        <w:rPr>
-          <w:color w:val="64748B"/>
-          <w:sz w:val="18"/>
-        </w:rPr>
-        <w:t xml:space="preserve"> — platform + recovery services.</w:t>
-      </w:r>
-      <w:r>
-        <w:rPr>
-          <w:b/>
-          <w:color w:val="64748B"/>
-          <w:sz w:val="18"/>
-        </w:rPr>
-        <w:t xml:space="preserve">   |   Clients: </w:t>
-      </w:r>
-      <w:r>
-        <w:rPr>
-          <w:color w:val="475569"/>
-          <w:sz w:val="18"/>
-        </w:rPr>
-        <w:t>national/regional health plans (names not public).</w:t>
-      </w:r>
-    </w:p>
-    <w:p>
-      <w:pPr>
-        <w:pStyle w:val="ListBullet"/>
-        <w:spacing w:after="20"/>
-      </w:pPr>
-      <w:r>
-        <w:rPr>
-          <w:b/>
-          <w:color w:val="0F172A"/>
-          <w:sz w:val="21"/>
-        </w:rPr>
-        <w:t>Codoxo</w:t>
-      </w:r>
-      <w:r>
-        <w:rPr>
-          <w:color w:val="475569"/>
-          <w:sz w:val="20"/>
-        </w:rPr>
-        <w:t xml:space="preserve"> — genAI Unified Cost Containment; 'Point Zero' intervenes pre-claim; 80M+ lives. $69M raised ($35M Series C led by CVS Health Ventures, Dec '25).</w:t>
-      </w:r>
-    </w:p>
-    <w:p>
-      <w:pPr>
-        <w:spacing w:after="120"/>
-        <w:ind w:left="360"/>
-      </w:pPr>
-      <w:r>
-        <w:rPr>
-          <w:color w:val="64748B"/>
-          <w:sz w:val="18"/>
-        </w:rPr>
-        <w:t xml:space="preserve">Managed services: </w:t>
-      </w:r>
-      <w:r>
-        <w:rPr>
-          <w:b/>
-          <w:color w:val="B45309"/>
-          <w:sz w:val="18"/>
-        </w:rPr>
-        <w:t>Hybrid</w:t>
-      </w:r>
-      <w:r>
-        <w:rPr>
-          <w:color w:val="64748B"/>
-          <w:sz w:val="18"/>
-        </w:rPr>
-        <w:t xml:space="preserve"> — provider education, prepay editing, fraud detection, audit, record review.</w:t>
-      </w:r>
-      <w:r>
-        <w:rPr>
-          <w:b/>
-          <w:color w:val="64748B"/>
-          <w:sz w:val="18"/>
-        </w:rPr>
-        <w:t xml:space="preserve">   |   Clients: </w:t>
-      </w:r>
-      <w:r>
-        <w:rPr>
-          <w:color w:val="475569"/>
-          <w:sz w:val="18"/>
-        </w:rPr>
-        <w:t>large US health plans (CVS Health Ventures-backed; names not public).</w:t>
-      </w:r>
-    </w:p>
-    <w:p>
-      <w:pPr>
-        <w:pStyle w:val="ListBullet"/>
-        <w:spacing w:after="20"/>
-      </w:pPr>
-      <w:r>
-        <w:rPr>
-          <w:b/>
-          <w:color w:val="0F172A"/>
-          <w:sz w:val="21"/>
-        </w:rPr>
-        <w:t>Lyric (lyric.ai)</w:t>
-      </w:r>
-      <w:r>
-        <w:rPr>
-          <w:color w:val="475569"/>
-          <w:sz w:val="20"/>
-        </w:rPr>
-        <w:t xml:space="preserve"> — AI payment-accuracy for health plans; reviews &gt;50% of US claims (~190M Americans). AI-forward; legacy roots in ClaimsXten.</w:t>
-      </w:r>
-    </w:p>
-    <w:p>
-      <w:pPr>
-        <w:spacing w:after="120"/>
-        <w:ind w:left="360"/>
-      </w:pPr>
-      <w:r>
-        <w:rPr>
-          <w:color w:val="64748B"/>
-          <w:sz w:val="18"/>
-        </w:rPr>
-        <w:t xml:space="preserve">Managed services: </w:t>
-      </w:r>
-      <w:r>
-        <w:rPr>
-          <w:b/>
-          <w:color w:val="B45309"/>
-          <w:sz w:val="18"/>
-        </w:rPr>
-        <w:t>Hybrid</w:t>
-      </w:r>
-      <w:r>
-        <w:rPr>
-          <w:color w:val="64748B"/>
-          <w:sz w:val="18"/>
-        </w:rPr>
-        <w:t xml:space="preserve"> — payment-accuracy platform + services.</w:t>
-      </w:r>
-      <w:r>
-        <w:rPr>
-          <w:b/>
-          <w:color w:val="64748B"/>
-          <w:sz w:val="18"/>
-        </w:rPr>
-        <w:t xml:space="preserve">   |   Clients: </w:t>
-      </w:r>
-      <w:r>
-        <w:rPr>
-          <w:color w:val="475569"/>
-          <w:sz w:val="18"/>
-        </w:rPr>
-        <w:t>major national health plans (~190M lives; names not public).</w:t>
-      </w:r>
-    </w:p>
-    <w:p>
-      <w:pPr>
-        <w:pStyle w:val="ListBullet"/>
-        <w:spacing w:after="20"/>
-      </w:pPr>
-      <w:r>
-        <w:rPr>
-          <w:b/>
-          <w:color w:val="0F172A"/>
-          <w:sz w:val="21"/>
-        </w:rPr>
-        <w:t>ClarisHealth</w:t>
-      </w:r>
-      <w:r>
-        <w:rPr>
-          <w:color w:val="475569"/>
-          <w:sz w:val="20"/>
-        </w:rPr>
-        <w:t xml:space="preserve"> — Pareo payment-integrity platform for health plans (recoveries + admin-cost reduction).</w:t>
-      </w:r>
-    </w:p>
-    <w:p>
-      <w:pPr>
-        <w:spacing w:after="120"/>
-        <w:ind w:left="360"/>
-      </w:pPr>
-      <w:r>
-        <w:rPr>
-          <w:color w:val="64748B"/>
-          <w:sz w:val="18"/>
-        </w:rPr>
-        <w:t xml:space="preserve">Managed services: </w:t>
-      </w:r>
-      <w:r>
-        <w:rPr>
-          <w:b/>
-          <w:color w:val="64748B"/>
-          <w:sz w:val="18"/>
-        </w:rPr>
-        <w:t>No</w:t>
-      </w:r>
-      <w:r>
-        <w:rPr>
-          <w:color w:val="64748B"/>
-          <w:sz w:val="18"/>
-        </w:rPr>
-        <w:t xml:space="preserve"> — enterprise software platform.</w:t>
-      </w:r>
-      <w:r>
-        <w:rPr>
-          <w:b/>
-          <w:color w:val="64748B"/>
-          <w:sz w:val="18"/>
-        </w:rPr>
-        <w:t xml:space="preserve">   |   Clients: </w:t>
-      </w:r>
-      <w:r>
-        <w:rPr>
-          <w:color w:val="475569"/>
-          <w:sz w:val="18"/>
-        </w:rPr>
-        <w:t>regional &amp; national health plans (names not public).</w:t>
-      </w:r>
-    </w:p>
-    <w:p>
-      <w:pPr>
-        <w:pStyle w:val="ListBullet"/>
-        <w:spacing w:after="20"/>
-      </w:pPr>
-      <w:r>
-        <w:rPr>
-          <w:b/>
-          <w:color w:val="0F172A"/>
-          <w:sz w:val="21"/>
-        </w:rPr>
-        <w:t>Rialtic</w:t>
-      </w:r>
-      <w:r>
-        <w:rPr>
-          <w:color w:val="475569"/>
-          <w:sz w:val="20"/>
-        </w:rPr>
-        <w:t xml:space="preserve"> — AI clinical &amp; payment-policy engine for payers (payment integrity / claims editing). Lighter public detail.</w:t>
-      </w:r>
-    </w:p>
-    <w:p>
-      <w:pPr>
-        <w:spacing w:after="120"/>
-        <w:ind w:left="360"/>
-      </w:pPr>
-      <w:r>
-        <w:rPr>
-          <w:color w:val="64748B"/>
-          <w:sz w:val="18"/>
-        </w:rPr>
-        <w:t xml:space="preserve">Managed services: </w:t>
-      </w:r>
-      <w:r>
-        <w:rPr>
-          <w:b/>
-          <w:color w:val="B45309"/>
-          <w:sz w:val="18"/>
-        </w:rPr>
-        <w:t>Hybrid</w:t>
-      </w:r>
-      <w:r>
-        <w:rPr>
-          <w:color w:val="64748B"/>
-          <w:sz w:val="18"/>
-        </w:rPr>
-        <w:t xml:space="preserve"> — policy/editing platform.</w:t>
-      </w:r>
-      <w:r>
-        <w:rPr>
-          <w:b/>
-          <w:color w:val="64748B"/>
-          <w:sz w:val="18"/>
-        </w:rPr>
-        <w:t xml:space="preserve">   |   Clients: </w:t>
-      </w:r>
-      <w:r>
-        <w:rPr>
-          <w:color w:val="475569"/>
-          <w:sz w:val="18"/>
-        </w:rPr>
-        <w:t>health plans (not public).</w:t>
-      </w:r>
     </w:p>
     <w:p>
       <w:pPr>
@@ -676,261 +1026,425 @@
         <w:t>3 · Claims operations &amp; adjudication automation</w:t>
       </w:r>
     </w:p>
+    <w:tbl>
+      <w:tblPr>
+        <w:tblStyle w:val="TableGrid"/>
+        <w:tblW w:type="auto" w:w="0"/>
+        <w:tblLook w:firstColumn="1" w:firstRow="1" w:lastColumn="0" w:lastRow="0" w:noHBand="0" w:noVBand="1" w:val="04A0"/>
+      </w:tblPr>
+      <w:tblGrid>
+        <w:gridCol w:w="3564"/>
+        <w:gridCol w:w="3564"/>
+        <w:gridCol w:w="3564"/>
+        <w:gridCol w:w="3564"/>
+      </w:tblGrid>
+      <w:tr>
+        <w:tc>
+          <w:tcPr>
+            <w:tcW w:type="dxa" w:w="1944"/>
+            <w:shd w:val="clear" w:fill="1E3A5F"/>
+            <w:vAlign w:val="center"/>
+          </w:tcPr>
+          <w:p>
+            <w:pPr>
+              <w:spacing w:after="0" w:before="0"/>
+            </w:pPr>
+            <w:r>
+              <w:rPr>
+                <w:b/>
+                <w:color w:val="FFFFFF"/>
+                <w:sz w:val="17"/>
+              </w:rPr>
+              <w:t>Company</w:t>
+            </w:r>
+          </w:p>
+        </w:tc>
+        <w:tc>
+          <w:tcPr>
+            <w:tcW w:type="dxa" w:w="6336"/>
+            <w:shd w:val="clear" w:fill="1E3A5F"/>
+            <w:vAlign w:val="center"/>
+          </w:tcPr>
+          <w:p>
+            <w:pPr>
+              <w:spacing w:after="0" w:before="0"/>
+            </w:pPr>
+            <w:r>
+              <w:rPr>
+                <w:b/>
+                <w:color w:val="FFFFFF"/>
+                <w:sz w:val="17"/>
+              </w:rPr>
+              <w:t>What they do</w:t>
+            </w:r>
+          </w:p>
+        </w:tc>
+        <w:tc>
+          <w:tcPr>
+            <w:tcW w:type="dxa" w:w="1872"/>
+            <w:shd w:val="clear" w:fill="1E3A5F"/>
+            <w:vAlign w:val="center"/>
+          </w:tcPr>
+          <w:p>
+            <w:pPr>
+              <w:spacing w:after="0" w:before="0"/>
+            </w:pPr>
+            <w:r>
+              <w:rPr>
+                <w:b/>
+                <w:color w:val="FFFFFF"/>
+                <w:sz w:val="17"/>
+              </w:rPr>
+              <w:t>Managed services</w:t>
+            </w:r>
+          </w:p>
+        </w:tc>
+        <w:tc>
+          <w:tcPr>
+            <w:tcW w:type="dxa" w:w="4104"/>
+            <w:shd w:val="clear" w:fill="1E3A5F"/>
+            <w:vAlign w:val="center"/>
+          </w:tcPr>
+          <w:p>
+            <w:pPr>
+              <w:spacing w:after="0" w:before="0"/>
+            </w:pPr>
+            <w:r>
+              <w:rPr>
+                <w:b/>
+                <w:color w:val="FFFFFF"/>
+                <w:sz w:val="17"/>
+              </w:rPr>
+              <w:t>Clients</w:t>
+            </w:r>
+          </w:p>
+        </w:tc>
+      </w:tr>
+      <w:tr>
+        <w:tc>
+          <w:tcPr>
+            <w:tcW w:type="dxa" w:w="1944"/>
+            <w:vAlign w:val="center"/>
+          </w:tcPr>
+          <w:p>
+            <w:pPr>
+              <w:spacing w:after="0" w:before="0"/>
+            </w:pPr>
+            <w:r>
+              <w:rPr>
+                <w:b/>
+                <w:color w:val="0F172A"/>
+                <w:sz w:val="17"/>
+              </w:rPr>
+              <w:t>Alaffia Health</w:t>
+            </w:r>
+          </w:p>
+        </w:tc>
+        <w:tc>
+          <w:tcPr>
+            <w:tcW w:type="dxa" w:w="6336"/>
+            <w:vAlign w:val="center"/>
+          </w:tcPr>
+          <w:p>
+            <w:pPr>
+              <w:spacing w:after="0" w:before="0"/>
+            </w:pPr>
+            <w:r>
+              <w:rPr>
+                <w:b w:val="0"/>
+                <w:color w:val="475569"/>
+                <w:sz w:val="17"/>
+              </w:rPr>
+              <w:t>AI + expert clinicians for end-to-end health-plan claims ops (UM, payment integrity, appeals); $55M Series B (Feb '26). Clearest AI-native BPaaS for payers.</w:t>
+            </w:r>
+          </w:p>
+        </w:tc>
+        <w:tc>
+          <w:tcPr>
+            <w:tcW w:type="dxa" w:w="1872"/>
+            <w:vAlign w:val="center"/>
+          </w:tcPr>
+          <w:p>
+            <w:pPr>
+              <w:spacing w:after="0" w:before="0"/>
+            </w:pPr>
+            <w:r>
+              <w:rPr>
+                <w:b/>
+                <w:color w:val="15803D"/>
+                <w:sz w:val="17"/>
+              </w:rPr>
+              <w:t>Yes</w:t>
+            </w:r>
+            <w:r>
+              <w:rPr>
+                <w:b w:val="0"/>
+                <w:color w:val="64748B"/>
+                <w:sz w:val="17"/>
+              </w:rPr>
+              <w:t xml:space="preserve"> (software + managed services)</w:t>
+            </w:r>
+          </w:p>
+        </w:tc>
+        <w:tc>
+          <w:tcPr>
+            <w:tcW w:type="dxa" w:w="4104"/>
+            <w:vAlign w:val="center"/>
+          </w:tcPr>
+          <w:p>
+            <w:pPr>
+              <w:spacing w:after="0" w:before="0"/>
+            </w:pPr>
+            <w:r>
+              <w:rPr>
+                <w:b w:val="0"/>
+                <w:color w:val="475569"/>
+                <w:sz w:val="17"/>
+              </w:rPr>
+              <w:t>Medicaid, Medicare Advantage &amp; commercial plans (&lt;=2M members), TPAs, cost-containment firms, gov agencies.</w:t>
+            </w:r>
+          </w:p>
+        </w:tc>
+      </w:tr>
+      <w:tr>
+        <w:tc>
+          <w:tcPr>
+            <w:tcW w:type="dxa" w:w="1944"/>
+            <w:vAlign w:val="center"/>
+          </w:tcPr>
+          <w:p>
+            <w:pPr>
+              <w:spacing w:after="0" w:before="0"/>
+            </w:pPr>
+            <w:r>
+              <w:rPr>
+                <w:b/>
+                <w:color w:val="0F172A"/>
+                <w:sz w:val="17"/>
+              </w:rPr>
+              <w:t>ClaimSphere</w:t>
+            </w:r>
+          </w:p>
+        </w:tc>
+        <w:tc>
+          <w:tcPr>
+            <w:tcW w:type="dxa" w:w="6336"/>
+            <w:vAlign w:val="center"/>
+          </w:tcPr>
+          <w:p>
+            <w:pPr>
+              <w:spacing w:after="0" w:before="0"/>
+            </w:pPr>
+            <w:r>
+              <w:rPr>
+                <w:b w:val="0"/>
+                <w:color w:val="475569"/>
+                <w:sz w:val="17"/>
+              </w:rPr>
+              <w:t>AI engine that auto-adjudicates claims against payer benefit logic, clinical edits, and COB with no human touch.</w:t>
+            </w:r>
+          </w:p>
+        </w:tc>
+        <w:tc>
+          <w:tcPr>
+            <w:tcW w:type="dxa" w:w="1872"/>
+            <w:vAlign w:val="center"/>
+          </w:tcPr>
+          <w:p>
+            <w:pPr>
+              <w:spacing w:after="0" w:before="0"/>
+            </w:pPr>
+            <w:r>
+              <w:rPr>
+                <w:b/>
+                <w:color w:val="64748B"/>
+                <w:sz w:val="17"/>
+              </w:rPr>
+              <w:t>No</w:t>
+            </w:r>
+          </w:p>
+        </w:tc>
+        <w:tc>
+          <w:tcPr>
+            <w:tcW w:type="dxa" w:w="4104"/>
+            <w:vAlign w:val="center"/>
+          </w:tcPr>
+          <w:p>
+            <w:pPr>
+              <w:spacing w:after="0" w:before="0"/>
+            </w:pPr>
+            <w:r>
+              <w:rPr>
+                <w:b w:val="0"/>
+                <w:color w:val="475569"/>
+                <w:sz w:val="17"/>
+              </w:rPr>
+              <w:t>Payers (names not public).</w:t>
+            </w:r>
+          </w:p>
+        </w:tc>
+      </w:tr>
+      <w:tr>
+        <w:tc>
+          <w:tcPr>
+            <w:tcW w:type="dxa" w:w="1944"/>
+            <w:vAlign w:val="center"/>
+          </w:tcPr>
+          <w:p>
+            <w:pPr>
+              <w:spacing w:after="0" w:before="0"/>
+            </w:pPr>
+            <w:r>
+              <w:rPr>
+                <w:b/>
+                <w:color w:val="0F172A"/>
+                <w:sz w:val="17"/>
+              </w:rPr>
+              <w:t>Amera</w:t>
+            </w:r>
+          </w:p>
+        </w:tc>
+        <w:tc>
+          <w:tcPr>
+            <w:tcW w:type="dxa" w:w="6336"/>
+            <w:vAlign w:val="center"/>
+          </w:tcPr>
+          <w:p>
+            <w:pPr>
+              <w:spacing w:after="0" w:before="0"/>
+            </w:pPr>
+            <w:r>
+              <w:rPr>
+                <w:b w:val="0"/>
+                <w:color w:val="475569"/>
+                <w:sz w:val="17"/>
+              </w:rPr>
+              <w:t>Automates claims processing for payers: messy PDF / EDI / non-standard submissions into structured, system-ready data.</w:t>
+            </w:r>
+          </w:p>
+        </w:tc>
+        <w:tc>
+          <w:tcPr>
+            <w:tcW w:type="dxa" w:w="1872"/>
+            <w:vAlign w:val="center"/>
+          </w:tcPr>
+          <w:p>
+            <w:pPr>
+              <w:spacing w:after="0" w:before="0"/>
+            </w:pPr>
+            <w:r>
+              <w:rPr>
+                <w:b/>
+                <w:color w:val="64748B"/>
+                <w:sz w:val="17"/>
+              </w:rPr>
+              <w:t>No</w:t>
+            </w:r>
+          </w:p>
+        </w:tc>
+        <w:tc>
+          <w:tcPr>
+            <w:tcW w:type="dxa" w:w="4104"/>
+            <w:vAlign w:val="center"/>
+          </w:tcPr>
+          <w:p>
+            <w:pPr>
+              <w:spacing w:after="0" w:before="0"/>
+            </w:pPr>
+            <w:r>
+              <w:rPr>
+                <w:b w:val="0"/>
+                <w:color w:val="475569"/>
+                <w:sz w:val="17"/>
+              </w:rPr>
+              <w:t>Health-insurance payers (names not public).</w:t>
+            </w:r>
+          </w:p>
+        </w:tc>
+      </w:tr>
+      <w:tr>
+        <w:tc>
+          <w:tcPr>
+            <w:tcW w:type="dxa" w:w="1944"/>
+            <w:vAlign w:val="center"/>
+          </w:tcPr>
+          <w:p>
+            <w:pPr>
+              <w:spacing w:after="0" w:before="0"/>
+            </w:pPr>
+            <w:r>
+              <w:rPr>
+                <w:b/>
+                <w:color w:val="0F172A"/>
+                <w:sz w:val="17"/>
+              </w:rPr>
+              <w:t>Curacel</w:t>
+            </w:r>
+          </w:p>
+        </w:tc>
+        <w:tc>
+          <w:tcPr>
+            <w:tcW w:type="dxa" w:w="6336"/>
+            <w:vAlign w:val="center"/>
+          </w:tcPr>
+          <w:p>
+            <w:pPr>
+              <w:spacing w:after="0" w:before="0"/>
+            </w:pPr>
+            <w:r>
+              <w:rPr>
+                <w:b w:val="0"/>
+                <w:color w:val="475569"/>
+                <w:sz w:val="17"/>
+              </w:rPr>
+              <w:t>AI claims processing/automation &amp; fraud detection for payors &amp; TPAs (strong in emerging markets - lower fit for a US-only scan).</w:t>
+            </w:r>
+          </w:p>
+        </w:tc>
+        <w:tc>
+          <w:tcPr>
+            <w:tcW w:type="dxa" w:w="1872"/>
+            <w:vAlign w:val="center"/>
+          </w:tcPr>
+          <w:p>
+            <w:pPr>
+              <w:spacing w:after="0" w:before="0"/>
+            </w:pPr>
+            <w:r>
+              <w:rPr>
+                <w:b/>
+                <w:color w:val="64748B"/>
+                <w:sz w:val="17"/>
+              </w:rPr>
+              <w:t>No</w:t>
+            </w:r>
+          </w:p>
+        </w:tc>
+        <w:tc>
+          <w:tcPr>
+            <w:tcW w:type="dxa" w:w="4104"/>
+            <w:vAlign w:val="center"/>
+          </w:tcPr>
+          <w:p>
+            <w:pPr>
+              <w:spacing w:after="0" w:before="0"/>
+            </w:pPr>
+            <w:r>
+              <w:rPr>
+                <w:b w:val="0"/>
+                <w:color w:val="475569"/>
+                <w:sz w:val="17"/>
+              </w:rPr>
+              <w:t>Payers, TPAs, providers (names not public).</w:t>
+            </w:r>
+          </w:p>
+        </w:tc>
+      </w:tr>
+    </w:tbl>
     <w:p>
       <w:pPr>
-        <w:pStyle w:val="ListBullet"/>
-        <w:spacing w:after="20"/>
+        <w:spacing w:after="80"/>
       </w:pPr>
-      <w:r>
-        <w:rPr>
-          <w:b/>
-          <w:color w:val="0F172A"/>
-          <w:sz w:val="21"/>
-        </w:rPr>
-        <w:t>Alaffia Health</w:t>
-      </w:r>
-      <w:r>
-        <w:rPr>
-          <w:color w:val="475569"/>
-          <w:sz w:val="20"/>
-        </w:rPr>
-        <w:t xml:space="preserve"> — AI + expert clinicians for end-to-end health-plan claims ops (UM, payment integrity, appeals); $55M Series B (Feb '26). Clearest AI-native BPaaS for payers.</w:t>
-      </w:r>
-    </w:p>
-    <w:p>
-      <w:pPr>
-        <w:spacing w:after="120"/>
-        <w:ind w:left="360"/>
-      </w:pPr>
-      <w:r>
-        <w:rPr>
-          <w:color w:val="64748B"/>
-          <w:sz w:val="18"/>
-        </w:rPr>
-        <w:t xml:space="preserve">Managed services: </w:t>
-      </w:r>
-      <w:r>
-        <w:rPr>
-          <w:b/>
-          <w:color w:val="15803D"/>
-          <w:sz w:val="18"/>
-        </w:rPr>
-        <w:t>Yes</w:t>
-      </w:r>
-      <w:r>
-        <w:rPr>
-          <w:color w:val="64748B"/>
-          <w:sz w:val="18"/>
-        </w:rPr>
-        <w:t xml:space="preserve"> — both software subscriptions and managed services; runs bill/chart reviews for plans.</w:t>
-      </w:r>
-      <w:r>
-        <w:rPr>
-          <w:b/>
-          <w:color w:val="64748B"/>
-          <w:sz w:val="18"/>
-        </w:rPr>
-        <w:t xml:space="preserve">   |   Clients: </w:t>
-      </w:r>
-      <w:r>
-        <w:rPr>
-          <w:color w:val="475569"/>
-          <w:sz w:val="18"/>
-        </w:rPr>
-        <w:t>Medicaid, Medicare Advantage &amp; commercial plans (&lt;=2M members), TPAs, cost-containment firms, gov agencies.</w:t>
-      </w:r>
-    </w:p>
-    <w:p>
-      <w:pPr>
-        <w:pStyle w:val="ListBullet"/>
-        <w:spacing w:after="20"/>
-      </w:pPr>
-      <w:r>
-        <w:rPr>
-          <w:b/>
-          <w:color w:val="0F172A"/>
-          <w:sz w:val="21"/>
-        </w:rPr>
-        <w:t>ClaimSphere</w:t>
-      </w:r>
-      <w:r>
-        <w:rPr>
-          <w:color w:val="475569"/>
-          <w:sz w:val="20"/>
-        </w:rPr>
-        <w:t xml:space="preserve"> — AI engine that auto-adjudicates claims against payer benefit logic, clinical edits, and COB with no human touch.</w:t>
-      </w:r>
-    </w:p>
-    <w:p>
-      <w:pPr>
-        <w:spacing w:after="120"/>
-        <w:ind w:left="360"/>
-      </w:pPr>
-      <w:r>
-        <w:rPr>
-          <w:color w:val="64748B"/>
-          <w:sz w:val="18"/>
-        </w:rPr>
-        <w:t xml:space="preserve">Managed services: </w:t>
-      </w:r>
-      <w:r>
-        <w:rPr>
-          <w:b/>
-          <w:color w:val="64748B"/>
-          <w:sz w:val="18"/>
-        </w:rPr>
-        <w:t>No</w:t>
-      </w:r>
-      <w:r>
-        <w:rPr>
-          <w:color w:val="64748B"/>
-          <w:sz w:val="18"/>
-        </w:rPr>
-        <w:t xml:space="preserve"> — adjudication automation engine.</w:t>
-      </w:r>
-      <w:r>
-        <w:rPr>
-          <w:b/>
-          <w:color w:val="64748B"/>
-          <w:sz w:val="18"/>
-        </w:rPr>
-        <w:t xml:space="preserve">   |   Clients: </w:t>
-      </w:r>
-      <w:r>
-        <w:rPr>
-          <w:color w:val="475569"/>
-          <w:sz w:val="18"/>
-        </w:rPr>
-        <w:t>payers (names not public).</w:t>
-      </w:r>
-    </w:p>
-    <w:p>
-      <w:pPr>
-        <w:pStyle w:val="ListBullet"/>
-        <w:spacing w:after="20"/>
-      </w:pPr>
-      <w:r>
-        <w:rPr>
-          <w:b/>
-          <w:color w:val="0F172A"/>
-          <w:sz w:val="21"/>
-        </w:rPr>
-        <w:t>Amera</w:t>
-      </w:r>
-      <w:r>
-        <w:rPr>
-          <w:color w:val="475569"/>
-          <w:sz w:val="20"/>
-        </w:rPr>
-        <w:t xml:space="preserve"> — automates claims processing for payers: messy PDF / EDI / non-standard submissions into structured, system-ready data.</w:t>
-      </w:r>
-    </w:p>
-    <w:p>
-      <w:pPr>
-        <w:spacing w:after="120"/>
-        <w:ind w:left="360"/>
-      </w:pPr>
-      <w:r>
-        <w:rPr>
-          <w:color w:val="64748B"/>
-          <w:sz w:val="18"/>
-        </w:rPr>
-        <w:t xml:space="preserve">Managed services: </w:t>
-      </w:r>
-      <w:r>
-        <w:rPr>
-          <w:b/>
-          <w:color w:val="64748B"/>
-          <w:sz w:val="18"/>
-        </w:rPr>
-        <w:t>No</w:t>
-      </w:r>
-      <w:r>
-        <w:rPr>
-          <w:color w:val="64748B"/>
-          <w:sz w:val="18"/>
-        </w:rPr>
-        <w:t xml:space="preserve"> — claims-processing software.</w:t>
-      </w:r>
-      <w:r>
-        <w:rPr>
-          <w:b/>
-          <w:color w:val="64748B"/>
-          <w:sz w:val="18"/>
-        </w:rPr>
-        <w:t xml:space="preserve">   |   Clients: </w:t>
-      </w:r>
-      <w:r>
-        <w:rPr>
-          <w:color w:val="475569"/>
-          <w:sz w:val="18"/>
-        </w:rPr>
-        <w:t>health-insurance payers (names not public).</w:t>
-      </w:r>
-    </w:p>
-    <w:p>
-      <w:pPr>
-        <w:pStyle w:val="ListBullet"/>
-        <w:spacing w:after="20"/>
-      </w:pPr>
-      <w:r>
-        <w:rPr>
-          <w:b/>
-          <w:color w:val="0F172A"/>
-          <w:sz w:val="21"/>
-        </w:rPr>
-        <w:t>Curacel</w:t>
-      </w:r>
-      <w:r>
-        <w:rPr>
-          <w:color w:val="475569"/>
-          <w:sz w:val="20"/>
-        </w:rPr>
-        <w:t xml:space="preserve"> — AI claims processing/automation &amp; fraud detection for payors &amp; TPAs (strong in emerging markets — lower fit for a US-only scan).</w:t>
-      </w:r>
-    </w:p>
-    <w:p>
-      <w:pPr>
-        <w:spacing w:after="120"/>
-        <w:ind w:left="360"/>
-      </w:pPr>
-      <w:r>
-        <w:rPr>
-          <w:color w:val="64748B"/>
-          <w:sz w:val="18"/>
-        </w:rPr>
-        <w:t xml:space="preserve">Managed services: </w:t>
-      </w:r>
-      <w:r>
-        <w:rPr>
-          <w:b/>
-          <w:color w:val="64748B"/>
-          <w:sz w:val="18"/>
-        </w:rPr>
-        <w:t>No</w:t>
-      </w:r>
-      <w:r>
-        <w:rPr>
-          <w:color w:val="64748B"/>
-          <w:sz w:val="18"/>
-        </w:rPr>
-        <w:t xml:space="preserve"> — claims infrastructure/software.</w:t>
-      </w:r>
-      <w:r>
-        <w:rPr>
-          <w:b/>
-          <w:color w:val="64748B"/>
-          <w:sz w:val="18"/>
-        </w:rPr>
-        <w:t xml:space="preserve">   |   Clients: </w:t>
-      </w:r>
-      <w:r>
-        <w:rPr>
-          <w:color w:val="475569"/>
-          <w:sz w:val="18"/>
-        </w:rPr>
-        <w:t>payers, TPAs, providers (names not public).</w:t>
-      </w:r>
     </w:p>
     <w:p>
       <w:pPr>
@@ -946,135 +1460,270 @@
         <w:t>4 · Risk adjustment &amp; coding accuracy (payer)</w:t>
       </w:r>
     </w:p>
+    <w:tbl>
+      <w:tblPr>
+        <w:tblStyle w:val="TableGrid"/>
+        <w:tblW w:type="auto" w:w="0"/>
+        <w:tblLook w:firstColumn="1" w:firstRow="1" w:lastColumn="0" w:lastRow="0" w:noHBand="0" w:noVBand="1" w:val="04A0"/>
+      </w:tblPr>
+      <w:tblGrid>
+        <w:gridCol w:w="3564"/>
+        <w:gridCol w:w="3564"/>
+        <w:gridCol w:w="3564"/>
+        <w:gridCol w:w="3564"/>
+      </w:tblGrid>
+      <w:tr>
+        <w:tc>
+          <w:tcPr>
+            <w:tcW w:type="dxa" w:w="1944"/>
+            <w:shd w:val="clear" w:fill="1E3A5F"/>
+            <w:vAlign w:val="center"/>
+          </w:tcPr>
+          <w:p>
+            <w:pPr>
+              <w:spacing w:after="0" w:before="0"/>
+            </w:pPr>
+            <w:r>
+              <w:rPr>
+                <w:b/>
+                <w:color w:val="FFFFFF"/>
+                <w:sz w:val="17"/>
+              </w:rPr>
+              <w:t>Company</w:t>
+            </w:r>
+          </w:p>
+        </w:tc>
+        <w:tc>
+          <w:tcPr>
+            <w:tcW w:type="dxa" w:w="6336"/>
+            <w:shd w:val="clear" w:fill="1E3A5F"/>
+            <w:vAlign w:val="center"/>
+          </w:tcPr>
+          <w:p>
+            <w:pPr>
+              <w:spacing w:after="0" w:before="0"/>
+            </w:pPr>
+            <w:r>
+              <w:rPr>
+                <w:b/>
+                <w:color w:val="FFFFFF"/>
+                <w:sz w:val="17"/>
+              </w:rPr>
+              <w:t>What they do</w:t>
+            </w:r>
+          </w:p>
+        </w:tc>
+        <w:tc>
+          <w:tcPr>
+            <w:tcW w:type="dxa" w:w="1872"/>
+            <w:shd w:val="clear" w:fill="1E3A5F"/>
+            <w:vAlign w:val="center"/>
+          </w:tcPr>
+          <w:p>
+            <w:pPr>
+              <w:spacing w:after="0" w:before="0"/>
+            </w:pPr>
+            <w:r>
+              <w:rPr>
+                <w:b/>
+                <w:color w:val="FFFFFF"/>
+                <w:sz w:val="17"/>
+              </w:rPr>
+              <w:t>Managed services</w:t>
+            </w:r>
+          </w:p>
+        </w:tc>
+        <w:tc>
+          <w:tcPr>
+            <w:tcW w:type="dxa" w:w="4104"/>
+            <w:shd w:val="clear" w:fill="1E3A5F"/>
+            <w:vAlign w:val="center"/>
+          </w:tcPr>
+          <w:p>
+            <w:pPr>
+              <w:spacing w:after="0" w:before="0"/>
+            </w:pPr>
+            <w:r>
+              <w:rPr>
+                <w:b/>
+                <w:color w:val="FFFFFF"/>
+                <w:sz w:val="17"/>
+              </w:rPr>
+              <w:t>Clients</w:t>
+            </w:r>
+          </w:p>
+        </w:tc>
+      </w:tr>
+      <w:tr>
+        <w:tc>
+          <w:tcPr>
+            <w:tcW w:type="dxa" w:w="1944"/>
+            <w:vAlign w:val="center"/>
+          </w:tcPr>
+          <w:p>
+            <w:pPr>
+              <w:spacing w:after="0" w:before="0"/>
+            </w:pPr>
+            <w:r>
+              <w:rPr>
+                <w:b/>
+                <w:color w:val="0F172A"/>
+                <w:sz w:val="17"/>
+              </w:rPr>
+              <w:t>Reveleer</w:t>
+            </w:r>
+          </w:p>
+        </w:tc>
+        <w:tc>
+          <w:tcPr>
+            <w:tcW w:type="dxa" w:w="6336"/>
+            <w:vAlign w:val="center"/>
+          </w:tcPr>
+          <w:p>
+            <w:pPr>
+              <w:spacing w:after="0" w:before="0"/>
+            </w:pPr>
+            <w:r>
+              <w:rPr>
+                <w:b w:val="0"/>
+                <w:color w:val="475569"/>
+                <w:sz w:val="17"/>
+              </w:rPr>
+              <w:t>AI risk-adjustment + quality/HEDIS for health plans; EVE maps missed diagnoses to HCCs at ~99% accuracy; record retrieval up to 80% faster.</w:t>
+            </w:r>
+          </w:p>
+        </w:tc>
+        <w:tc>
+          <w:tcPr>
+            <w:tcW w:type="dxa" w:w="1872"/>
+            <w:vAlign w:val="center"/>
+          </w:tcPr>
+          <w:p>
+            <w:pPr>
+              <w:spacing w:after="0" w:before="0"/>
+            </w:pPr>
+            <w:r>
+              <w:rPr>
+                <w:b/>
+                <w:color w:val="B45309"/>
+                <w:sz w:val="17"/>
+              </w:rPr>
+              <w:t>Hybrid</w:t>
+            </w:r>
+            <w:r>
+              <w:rPr>
+                <w:b w:val="0"/>
+                <w:color w:val="64748B"/>
+                <w:sz w:val="17"/>
+              </w:rPr>
+              <w:t xml:space="preserve"> (+ retrieval/coding services)</w:t>
+            </w:r>
+          </w:p>
+        </w:tc>
+        <w:tc>
+          <w:tcPr>
+            <w:tcW w:type="dxa" w:w="4104"/>
+            <w:vAlign w:val="center"/>
+          </w:tcPr>
+          <w:p>
+            <w:pPr>
+              <w:spacing w:after="0" w:before="0"/>
+            </w:pPr>
+            <w:r>
+              <w:rPr>
+                <w:b w:val="0"/>
+                <w:color w:val="475569"/>
+                <w:sz w:val="17"/>
+              </w:rPr>
+              <w:t>Health plans &amp; risk-bearing providers (names largely not public).</w:t>
+            </w:r>
+          </w:p>
+        </w:tc>
+      </w:tr>
+      <w:tr>
+        <w:tc>
+          <w:tcPr>
+            <w:tcW w:type="dxa" w:w="1944"/>
+            <w:vAlign w:val="center"/>
+          </w:tcPr>
+          <w:p>
+            <w:pPr>
+              <w:spacing w:after="0" w:before="0"/>
+            </w:pPr>
+            <w:r>
+              <w:rPr>
+                <w:b/>
+                <w:color w:val="0F172A"/>
+                <w:sz w:val="17"/>
+              </w:rPr>
+              <w:t>Pareto Intelligence</w:t>
+            </w:r>
+          </w:p>
+        </w:tc>
+        <w:tc>
+          <w:tcPr>
+            <w:tcW w:type="dxa" w:w="6336"/>
+            <w:vAlign w:val="center"/>
+          </w:tcPr>
+          <w:p>
+            <w:pPr>
+              <w:spacing w:after="0" w:before="0"/>
+            </w:pPr>
+            <w:r>
+              <w:rPr>
+                <w:b w:val="0"/>
+                <w:color w:val="475569"/>
+                <w:sz w:val="17"/>
+              </w:rPr>
+              <w:t>Payer risk-adjustment &amp; analytics (Pareto Hub data environment + actuarial/analytics services).</w:t>
+            </w:r>
+          </w:p>
+        </w:tc>
+        <w:tc>
+          <w:tcPr>
+            <w:tcW w:type="dxa" w:w="1872"/>
+            <w:vAlign w:val="center"/>
+          </w:tcPr>
+          <w:p>
+            <w:pPr>
+              <w:spacing w:after="0" w:before="0"/>
+            </w:pPr>
+            <w:r>
+              <w:rPr>
+                <w:b/>
+                <w:color w:val="B45309"/>
+                <w:sz w:val="17"/>
+              </w:rPr>
+              <w:t>Hybrid</w:t>
+            </w:r>
+          </w:p>
+        </w:tc>
+        <w:tc>
+          <w:tcPr>
+            <w:tcW w:type="dxa" w:w="4104"/>
+            <w:vAlign w:val="center"/>
+          </w:tcPr>
+          <w:p>
+            <w:pPr>
+              <w:spacing w:after="0" w:before="0"/>
+            </w:pPr>
+            <w:r>
+              <w:rPr>
+                <w:b w:val="0"/>
+                <w:color w:val="475569"/>
+                <w:sz w:val="17"/>
+              </w:rPr>
+              <w:t>Health plans (names not public).</w:t>
+            </w:r>
+          </w:p>
+        </w:tc>
+      </w:tr>
+    </w:tbl>
     <w:p>
       <w:pPr>
-        <w:pStyle w:val="ListBullet"/>
-        <w:spacing w:after="20"/>
+        <w:spacing w:after="80"/>
       </w:pPr>
-      <w:r>
-        <w:rPr>
-          <w:b/>
-          <w:color w:val="0F172A"/>
-          <w:sz w:val="21"/>
-        </w:rPr>
-        <w:t>Reveleer</w:t>
-      </w:r>
-      <w:r>
-        <w:rPr>
-          <w:color w:val="475569"/>
-          <w:sz w:val="20"/>
-        </w:rPr>
-        <w:t xml:space="preserve"> — AI risk-adjustment + quality/HEDIS for health plans; EVE maps missed diagnoses to HCCs at ~99% accuracy; record retrieval up to 80% faster.</w:t>
-      </w:r>
     </w:p>
-    <w:p>
-      <w:pPr>
-        <w:spacing w:after="120"/>
-        <w:ind w:left="360"/>
-      </w:pPr>
-      <w:r>
-        <w:rPr>
-          <w:color w:val="64748B"/>
-          <w:sz w:val="18"/>
-        </w:rPr>
-        <w:t xml:space="preserve">Managed services: </w:t>
-      </w:r>
-      <w:r>
-        <w:rPr>
-          <w:b/>
-          <w:color w:val="B45309"/>
-          <w:sz w:val="18"/>
-        </w:rPr>
-        <w:t>Hybrid</w:t>
-      </w:r>
-      <w:r>
-        <w:rPr>
-          <w:color w:val="64748B"/>
-          <w:sz w:val="18"/>
-        </w:rPr>
-        <w:t xml:space="preserve"> — AI platform + retrieval/coding services (~3x ROI in year one).</w:t>
-      </w:r>
-      <w:r>
-        <w:rPr>
-          <w:b/>
-          <w:color w:val="64748B"/>
-          <w:sz w:val="18"/>
-        </w:rPr>
-        <w:t xml:space="preserve">   |   Clients: </w:t>
-      </w:r>
-      <w:r>
-        <w:rPr>
-          <w:color w:val="475569"/>
-          <w:sz w:val="18"/>
-        </w:rPr>
-        <w:t>health plans &amp; risk-bearing providers (names largely not public).</w:t>
-      </w:r>
-    </w:p>
-    <w:p>
-      <w:pPr>
-        <w:pStyle w:val="ListBullet"/>
-        <w:spacing w:after="20"/>
-      </w:pPr>
-      <w:r>
-        <w:rPr>
-          <w:b/>
-          <w:color w:val="0F172A"/>
-          <w:sz w:val="21"/>
-        </w:rPr>
-        <w:t>Pareto Intelligence</w:t>
-      </w:r>
-      <w:r>
-        <w:rPr>
-          <w:color w:val="475569"/>
-          <w:sz w:val="20"/>
-        </w:rPr>
-        <w:t xml:space="preserve"> — payer risk-adjustment &amp; analytics (Pareto Hub data environment + actuarial/analytics services).</w:t>
-      </w:r>
-    </w:p>
-    <w:p>
-      <w:pPr>
-        <w:spacing w:after="120"/>
-        <w:ind w:left="360"/>
-      </w:pPr>
-      <w:r>
-        <w:rPr>
-          <w:color w:val="64748B"/>
-          <w:sz w:val="18"/>
-        </w:rPr>
-        <w:t xml:space="preserve">Managed services: </w:t>
-      </w:r>
-      <w:r>
-        <w:rPr>
-          <w:b/>
-          <w:color w:val="B45309"/>
-          <w:sz w:val="18"/>
-        </w:rPr>
-        <w:t>Hybrid</w:t>
-      </w:r>
-      <w:r>
-        <w:rPr>
-          <w:color w:val="64748B"/>
-          <w:sz w:val="18"/>
-        </w:rPr>
-        <w:t xml:space="preserve"> — analytics platform + services.</w:t>
-      </w:r>
-      <w:r>
-        <w:rPr>
-          <w:b/>
-          <w:color w:val="64748B"/>
-          <w:sz w:val="18"/>
-        </w:rPr>
-        <w:t xml:space="preserve">   |   Clients: </w:t>
-      </w:r>
-      <w:r>
-        <w:rPr>
-          <w:color w:val="475569"/>
-          <w:sz w:val="18"/>
-        </w:rPr>
-        <w:t>health plans (names not public).</w:t>
-      </w:r>
-    </w:p>
-    <w:p/>
     <w:p>
       <w:pPr>
         <w:spacing w:after="80"/>
@@ -1163,12 +1812,12 @@
           <w:color w:val="475569"/>
           <w:sz w:val="19"/>
         </w:rPr>
-        <w:t>even on the payer side, most AI-natives ship software; only Alaffia (and Cohere's delegated option) truly run the operation. The 'large service provider that operates payer claims ops with AI inside' lane is largely open — a differentiator worth naming.</w:t>
+        <w:t>even on the payer side, most AI-natives ship software; only Alaffia (and Cohere's delegated option) truly run the operation. The 'large service provider that operates payer claims ops with AI inside' lane is largely open - a differentiator worth naming.</w:t>
       </w:r>
     </w:p>
     <w:sectPr>
-      <w:pgSz w:w="12240" w:h="15840"/>
-      <w:pgMar w:top="1440" w:right="1800" w:bottom="1440" w:left="1800" w:header="720" w:footer="720" w:gutter="0"/>
+      <w:pgSz w:w="15840" w:h="12240" w:orient="landscape"/>
+      <w:pgMar w:top="792" w:right="792" w:bottom="792" w:left="792" w:header="720" w:footer="720" w:gutter="0"/>
       <w:cols w:space="720"/>
       <w:docGrid w:linePitch="360"/>
     </w:sectPr>
@@ -1541,7 +2190,7 @@
     <w:rsid w:val="00FC693F"/>
     <w:rPr>
       <w:rFonts w:ascii="Calibri" w:hAnsi="Calibri"/>
-      <w:sz w:val="20"/>
+      <w:sz w:val="18"/>
     </w:rPr>
   </w:style>
   <w:style w:type="paragraph" w:styleId="Header">

</xml_diff>